<commit_message>
Introduce 8 deliberate misconfigurations for Week 1
</commit_message>
<xml_diff>
--- a/AWS_Environment_Setup_Log.docx
+++ b/AWS_Environment_Setup_Log.docx
@@ -1668,9 +1668,626 @@
       <w:pPr>
         <w:pStyle w:val="Heading1"/>
       </w:pPr>
+      <w:r>
+        <w:t>11. GitHub Repository Setup</w:t>
+      </w:r>
+    </w:p>
+    <w:p>
+      <w:pPr/>
+      <w:r>
+        <w:rPr>
+          <w:b/>
+          <w:i/>
+          <w:color w:val="2E74B5"/>
+          <w:sz w:val="20"/>
+        </w:rPr>
+        <w:t xml:space="preserve">Why: </w:t>
+      </w:r>
+      <w:r>
+        <w:rPr>
+          <w:i/>
+          <w:color w:val="2E74B5"/>
+          <w:sz w:val="20"/>
+        </w:rPr>
+        <w:t>The Student Capstone Guide requires a repository containing all configurations, scripts, and notebooks, private but shared with the program team, reproducible enough that 'anyone with the repo should be able to rebuild your lab in an hour.' It also names one specific required file: WEEKLOG.md, updated weekly per the guide's Saturday check-in workflow.</w:t>
+      </w:r>
+    </w:p>
+    <w:p>
+      <w:pPr/>
+      <w:r>
+        <w:rPr>
+          <w:b/>
+        </w:rPr>
+        <w:t xml:space="preserve">Step 24. </w:t>
+      </w:r>
+      <w:r>
+        <w:rPr>
+          <w:b/>
+        </w:rPr>
+        <w:t>Reviewed the Student Capstone Guide and the CloudGuardian brief PDFs for repo requirements before creating the repo.</w:t>
+      </w:r>
+    </w:p>
+    <w:p>
+      <w:pPr/>
+      <w:r>
+        <w:rPr>
+          <w:b w:val="0"/>
+          <w:i w:val="0"/>
+          <w:sz w:val="22"/>
+        </w:rPr>
+        <w:t>No fixed folder-tree format is mandated. Confirmed requirements: repo must be private but shared with the program team; must contain all configs/scripts/notebooks; WEEKLOG.md is explicitly named in the guide's weekly workflow section (Saturday status note).</w:t>
+      </w:r>
+    </w:p>
+    <w:p>
+      <w:pPr/>
+      <w:r>
+        <w:rPr>
+          <w:b/>
+          <w:i/>
+          <w:color w:val="2E74B5"/>
+          <w:sz w:val="20"/>
+        </w:rPr>
+        <w:t xml:space="preserve">Why: </w:t>
+      </w:r>
+      <w:r>
+        <w:rPr>
+          <w:i/>
+          <w:color w:val="2E74B5"/>
+          <w:sz w:val="20"/>
+        </w:rPr>
+        <w:t>Checking the actual brief documents first avoids guessing at a structure and having to reorganize later -- 'documentation and reproducibility' is 15% of the grade, so the repo layout is not cosmetic.</w:t>
+      </w:r>
+    </w:p>
+    <w:p>
+      <w:pPr/>
+      <w:r>
+        <w:rPr>
+          <w:b/>
+        </w:rPr>
+        <w:t xml:space="preserve">Step 25. </w:t>
+      </w:r>
+      <w:r>
+        <w:rPr>
+          <w:b/>
+        </w:rPr>
+        <w:t>Created folders matching the brief's Section 6 deliverables list -- misconfigurations/, prioritization/, llm/, remediation/, compliance/ (each with a .gitkeep placeholder so git tracks the empty folder) -- plus a WEEKLOG.md at the repo root with Week 1's status filled in.</w:t>
+      </w:r>
+    </w:p>
+    <w:p>
+      <w:pPr/>
+      <w:r>
+        <w:rPr>
+          <w:b w:val="0"/>
+          <w:i w:val="0"/>
+          <w:sz w:val="22"/>
+        </w:rPr>
+        <w:t>Folder structure and WEEKLOG.md created in the AWS/ working directory, ready to be committed.</w:t>
+      </w:r>
+    </w:p>
+    <w:p>
+      <w:pPr/>
+      <w:r>
+        <w:rPr>
+          <w:b/>
+          <w:i/>
+          <w:color w:val="2E74B5"/>
+          <w:sz w:val="20"/>
+        </w:rPr>
+        <w:t xml:space="preserve">Why: </w:t>
+      </w:r>
+      <w:r>
+        <w:rPr>
+          <w:i/>
+          <w:color w:val="2E74B5"/>
+          <w:sz w:val="20"/>
+        </w:rPr>
+        <w:t>Each folder maps directly to a named Week 2/Week 3 deliverable (misconfiguration catalogue, prioritization notebook, LLM prompt library, remediation functions, compliance crosswalk) so a grader -- or future self -- can find each piece without hunting through a flat file list.</w:t>
+      </w:r>
+    </w:p>
+    <w:p>
+      <w:pPr/>
+      <w:r>
+        <w:rPr>
+          <w:b/>
+        </w:rPr>
+        <w:t xml:space="preserve">Step 26. </w:t>
+      </w:r>
+      <w:r>
+        <w:rPr>
+          <w:b/>
+        </w:rPr>
+        <w:t>Hardened .gitignore before the first commit: added prowler-env/ (the Python venv, large and machine-specific), __pycache__/, *.csv and sse.json (credential-adjacent files), tfplan/*.tfplan (Terraform plan binaries can embed sensitive variable values like the DB password in plaintext even though the CLI masks them on screen), and ~$* (Word's auto-generated lock files).</w:t>
+      </w:r>
+    </w:p>
+    <w:p>
+      <w:pPr/>
+      <w:r>
+        <w:rPr>
+          <w:b w:val="0"/>
+          <w:i w:val="0"/>
+          <w:sz w:val="22"/>
+        </w:rPr>
+        <w:t>Verified via a manual scan of all .docx files and .tf files for AWS access key patterns, secret-like strings, and plaintext passwords -- none found. Confirmed safe to commit the rest of the repo as-is.</w:t>
+      </w:r>
+    </w:p>
+    <w:p>
+      <w:pPr/>
+      <w:r>
+        <w:rPr>
+          <w:b/>
+          <w:i/>
+          <w:color w:val="2E74B5"/>
+          <w:sz w:val="20"/>
+        </w:rPr>
+        <w:t xml:space="preserve">Why: </w:t>
+      </w:r>
+      <w:r>
+        <w:rPr>
+          <w:i/>
+          <w:color w:val="2E74B5"/>
+          <w:sz w:val="20"/>
+        </w:rPr>
+        <w:t>A capstone repo submitted to a program team is effectively a public-within-cohort artifact. Committing a tfplan or an access key by accident is a common, embarrassing mistake that is much cheaper to prevent up front than to scrub from git history after the fact.</w:t>
+      </w:r>
+    </w:p>
+    <w:p>
+      <w:pPr/>
+      <w:r>
+        <w:rPr>
+          <w:b/>
+        </w:rPr>
+        <w:t xml:space="preserve">Step 27. </w:t>
+      </w:r>
+      <w:r>
+        <w:rPr>
+          <w:b/>
+        </w:rPr>
+        <w:t>Ran git init, git add -A, git commit -m "Clean baseline before misconfigurations", git tag v1.0-baseline-aws, git branch -M main in the AWS/ folder.</w:t>
+      </w:r>
+    </w:p>
+    <w:p>
+      <w:pPr/>
+      <w:r>
+        <w:rPr>
+          <w:b w:val="0"/>
+          <w:i w:val="0"/>
+          <w:sz w:val="22"/>
+        </w:rPr>
+        <w:t>Local repository initialized and the clean baseline committed and tagged.</w:t>
+      </w:r>
+    </w:p>
+    <w:p>
+      <w:pPr/>
+      <w:r>
+        <w:rPr>
+          <w:b/>
+          <w:i/>
+          <w:color w:val="2E74B5"/>
+          <w:sz w:val="20"/>
+        </w:rPr>
+        <w:t xml:space="preserve">Why: </w:t>
+      </w:r>
+      <w:r>
+        <w:rPr>
+          <w:i/>
+          <w:color w:val="2E74B5"/>
+          <w:sz w:val="20"/>
+        </w:rPr>
+        <w:t>This is the restore point the brief implicitly expects -- before Task 12 introduces 8 deliberate misconfigurations, there needs to be a tagged, working, clean commit to diff and roll back against.</w:t>
+      </w:r>
+    </w:p>
+    <w:p>
+      <w:pPr>
+        <w:pStyle w:val="Heading2"/>
+      </w:pPr>
+      <w:r>
+        <w:t>Known issue: 'remote: Repository not found' on first push</w:t>
+      </w:r>
+    </w:p>
+    <w:p>
+      <w:pPr/>
+      <w:r>
+        <w:rPr>
+          <w:b w:val="0"/>
+          <w:i w:val="0"/>
+          <w:sz w:val="22"/>
+        </w:rPr>
+        <w:t>After running git remote add origin https://github.com/yesiamabhi7-Arc/cloudguardian-capstone.git and git push -u origin main:</w:t>
+      </w:r>
+    </w:p>
+    <w:p>
+      <w:pPr>
+        <w:shd w:val="clear" w:color="auto" w:fill="F2F2F2"/>
+      </w:pPr>
+      <w:r>
+        <w:rPr>
+          <w:rFonts w:ascii="Consolas" w:hAnsi="Consolas"/>
+          <w:sz w:val="19"/>
+        </w:rPr>
+        <w:t>remote: Repository not found.</w:t>
+        <w:br/>
+      </w:r>
+      <w:r>
+        <w:rPr>
+          <w:rFonts w:ascii="Consolas" w:hAnsi="Consolas"/>
+          <w:sz w:val="19"/>
+        </w:rPr>
+        <w:t>fatal: repository 'https://github.com/yesiamabhi7-Arc/cloudguardian-capstone.git/' not found</w:t>
+      </w:r>
+    </w:p>
+    <w:p>
+      <w:pPr/>
+      <w:r>
+        <w:rPr>
+          <w:b w:val="0"/>
+          <w:i w:val="0"/>
+          <w:sz w:val="22"/>
+        </w:rPr>
+        <w:t>Cause: the remote GitHub repository had not actually been created yet -- the local git remote was configured to point at a URL that did not exist on GitHub's side. (Note: GitHub returns this same generic message both when a repo truly does not exist and when it exists but is private and the push is not authenticated -- deliberately, so the error cannot be used to fingerprint which private repos exist.)</w:t>
+      </w:r>
+    </w:p>
+    <w:p>
+      <w:pPr/>
+      <w:r>
+        <w:rPr>
+          <w:b w:val="0"/>
+          <w:i w:val="0"/>
+          <w:sz w:val="22"/>
+        </w:rPr>
+        <w:t>Fix: create the repository first at github.com/new (owner yesiamabhi7-Arc, name cloudguardian-capstone, Private, and crucially leave README/.gitignore/license all unchecked, since a local repo already exists and adding those on GitHub's side would create conflicting history). Once created, the existing git push -u origin main succeeds without re-running git remote add.</w:t>
+      </w:r>
+    </w:p>
+    <w:p>
+      <w:pPr>
+        <w:pBdr>
+          <w:left w:val="single" w:sz="18" w:space="8" w:color="2E74B5"/>
+        </w:pBdr>
+      </w:pPr>
+      <w:r>
+        <w:rPr>
+          <w:i/>
+          <w:color w:val="2E74B5"/>
+        </w:rPr>
+        <w:t xml:space="preserve">  Also flagged for when the push is retried: GitHub retired password authentication in 2021. If prompted for a password, a Personal Access Token (Settings -&gt; Developer settings -&gt; Personal access tokens) must be used instead, or git can be authenticated via the GitHub CLI (gh auth login).</w:t>
+      </w:r>
+    </w:p>
+    <w:p>
+      <w:pPr>
+        <w:pStyle w:val="Heading1"/>
+      </w:pPr>
+      <w:r>
+        <w:t>12. Introducing the 8 Deliberate Misconfigurations</w:t>
+      </w:r>
+    </w:p>
+    <w:p>
+      <w:pPr/>
+      <w:r>
+        <w:rPr>
+          <w:b/>
+          <w:i/>
+          <w:color w:val="2E74B5"/>
+          <w:sz w:val="20"/>
+        </w:rPr>
+        <w:t xml:space="preserve">Why: </w:t>
+      </w:r>
+      <w:r>
+        <w:rPr>
+          <w:i/>
+          <w:color w:val="2E74B5"/>
+          <w:sz w:val="20"/>
+        </w:rPr>
+        <w:t>This is the core Week 1 deliverable (Task 12): a controlled set of misconfigurations across IAM, storage, networking, encryption, and logging, spread across categories so the Week 2 Prowler re-scan and the prioritization model have real detectable deltas to work with, each traceable to a specific baseline PASS finding that flips to FAIL.</w:t>
+      </w:r>
+    </w:p>
+    <w:p>
+      <w:pPr/>
+      <w:r>
+        <w:rPr>
+          <w:b/>
+        </w:rPr>
+        <w:t xml:space="preserve">Step 28. </w:t>
+      </w:r>
+      <w:r>
+        <w:rPr>
+          <w:b/>
+        </w:rPr>
+        <w:t>Queried the baseline scan CSV (findings/baseline.csv) directly to identify which checks were currently PASS before choosing what to break, rather than guessing.</w:t>
+      </w:r>
+    </w:p>
+    <w:p>
+      <w:pPr/>
+      <w:r>
+        <w:rPr>
+          <w:b w:val="0"/>
+          <w:i w:val="0"/>
+          <w:sz w:val="22"/>
+        </w:rPr>
+        <w:t>Found that SSH (port 22) was already open to 0.0.0.0/0 on the live EC2 instance -- a pre-existing critical fail caused by variables.tf defaulting ssh_ingress_cidr to 0.0.0.0/0, not something deliberately introduced. Flagged as a real, unintended exposure to fix separately from the 8 planned misconfigurations.</w:t>
+      </w:r>
+    </w:p>
+    <w:p>
+      <w:pPr/>
+      <w:r>
+        <w:rPr>
+          <w:b/>
+          <w:i/>
+          <w:color w:val="2E74B5"/>
+          <w:sz w:val="20"/>
+        </w:rPr>
+        <w:t xml:space="preserve">Why: </w:t>
+      </w:r>
+      <w:r>
+        <w:rPr>
+          <w:i/>
+          <w:color w:val="2E74B5"/>
+          <w:sz w:val="20"/>
+        </w:rPr>
+        <w:t>Grounding the misconfig choices in the actual baseline data (rather than assumption) avoids picking something that was already broken -- which would produce no real before/after delta for the Week 2 comparison and misrepresent the exercise in the report.</w:t>
+      </w:r>
+    </w:p>
+    <w:p>
+      <w:pPr/>
+      <w:r>
+        <w:rPr>
+          <w:b/>
+        </w:rPr>
+        <w:t xml:space="preserve">Step 29. </w:t>
+      </w:r>
+      <w:r>
+        <w:rPr>
+          <w:b/>
+        </w:rPr>
+        <w:t>Introduced 7 of the 8 misconfigurations directly in the Terraform source (each tagged with a MISCONFIG #N comment, one-line rationale, and revert instructions in-line, to make the misconfiguration catalogue document straightforward to write): #1 storage.tf -- S3 bucket public-access-block flags flipped to false; #2 storage.tf -- default KMS encryption resource removed; #3 database.tf -- RDS publicly_accessible flipped to true; #5 database.tf -- RDS storage_encrypted flipped to false; #4 network.tf -- data subnet map_public_ip_on_launch flipped to true; #6 web.tf -- web IAM role's S3 policy widened from scoped actions to s3:* on "*"; #7 web.tf -- web IAM role's trust policy Principal widened from ec2.amazonaws.com to "*".</w:t>
+      </w:r>
+    </w:p>
+    <w:p>
+      <w:pPr/>
+      <w:r>
+        <w:rPr>
+          <w:b w:val="0"/>
+          <w:i w:val="0"/>
+          <w:sz w:val="22"/>
+        </w:rPr>
+        <w:t>All 4 files edited and verified. terraform fmt / validate / plan queued as the next step before apply.</w:t>
+      </w:r>
+    </w:p>
+    <w:p>
+      <w:pPr/>
+      <w:r>
+        <w:rPr>
+          <w:b/>
+          <w:i/>
+          <w:color w:val="2E74B5"/>
+          <w:sz w:val="20"/>
+        </w:rPr>
+        <w:t xml:space="preserve">Why: </w:t>
+      </w:r>
+      <w:r>
+        <w:rPr>
+          <w:i/>
+          <w:color w:val="2E74B5"/>
+          <w:sz w:val="20"/>
+        </w:rPr>
+        <w:t>Each misconfig maps to a specific baseline PASS finding (mostly critical/high severity) so the Week 2 re-scan produces a provable, citable delta rather than a vague claim of 'more findings.'</w:t>
+      </w:r>
+    </w:p>
+    <w:p>
+      <w:pPr/>
+      <w:r>
+        <w:rPr>
+          <w:b/>
+        </w:rPr>
+        <w:t xml:space="preserve">Step 30. </w:t>
+      </w:r>
+      <w:r>
+        <w:rPr>
+          <w:b/>
+        </w:rPr>
+        <w:t>Misconfig #8 (logging): no code change made. Documented the absence of a CloudTrail trail as the logging-category misconfiguration, since it was already reflected as a gap in the baseline scan's CloudTrail findings.</w:t>
+      </w:r>
+    </w:p>
+    <w:p>
+      <w:pPr/>
+      <w:r>
+        <w:rPr>
+          <w:b w:val="0"/>
+          <w:i w:val="0"/>
+          <w:sz w:val="22"/>
+        </w:rPr>
+        <w:t>Catalogued as-is rather than toggled, since there was nothing previously enabled to toggle off.</w:t>
+      </w:r>
+    </w:p>
+    <w:p>
+      <w:pPr/>
+      <w:r>
+        <w:rPr>
+          <w:b/>
+          <w:i/>
+          <w:color w:val="2E74B5"/>
+          <w:sz w:val="20"/>
+        </w:rPr>
+        <w:t xml:space="preserve">Why: </w:t>
+      </w:r>
+      <w:r>
+        <w:rPr>
+          <w:i/>
+          <w:color w:val="2E74B5"/>
+          <w:sz w:val="20"/>
+        </w:rPr>
+        <w:t>The brief's own real-world problem statement names 'missing logging' as one of its four example misconfiguration types -- documenting a genuine, already-present audit gap is consistent with that framing and mirrors how this actually shows up in real environments (retrofitted late, not deliberately disabled).</w:t>
+      </w:r>
+    </w:p>
+    <w:p>
+      <w:pPr>
+        <w:pStyle w:val="Heading2"/>
+      </w:pPr>
+      <w:r>
+        <w:t>Known issue: TF_VAR_db_password prompt in a new terminal session</w:t>
+      </w:r>
+    </w:p>
+    <w:p>
+      <w:pPr/>
+      <w:r>
+        <w:rPr>
+          <w:b w:val="0"/>
+          <w:i w:val="0"/>
+          <w:sz w:val="22"/>
+        </w:rPr>
+        <w:t>Running terraform plan in a freshly opened PowerShell window (one that never ran $env:TF_VAR_db_password in that session) produces an interactive prompt:</w:t>
+      </w:r>
+    </w:p>
+    <w:p>
+      <w:pPr>
+        <w:shd w:val="clear" w:color="auto" w:fill="F2F2F2"/>
+      </w:pPr>
+      <w:r>
+        <w:rPr>
+          <w:rFonts w:ascii="Consolas" w:hAnsi="Consolas"/>
+          <w:sz w:val="19"/>
+        </w:rPr>
+        <w:t>var.db_password</w:t>
+        <w:br/>
+      </w:r>
+      <w:r>
+        <w:rPr>
+          <w:rFonts w:ascii="Consolas" w:hAnsi="Consolas"/>
+          <w:sz w:val="19"/>
+        </w:rPr>
+        <w:t xml:space="preserve">  Master password for RDS (supply via TF_VAR_db_password, never commit)</w:t>
+        <w:br/>
+      </w:r>
+      <w:r>
+        <w:rPr>
+          <w:rFonts w:ascii="Consolas" w:hAnsi="Consolas"/>
+          <w:sz w:val="19"/>
+        </w:rPr>
+        <w:t xml:space="preserve">  Enter a value:</w:t>
+      </w:r>
+    </w:p>
+    <w:p>
+      <w:pPr/>
+      <w:r>
+        <w:rPr>
+          <w:b w:val="0"/>
+          <w:i w:val="0"/>
+          <w:sz w:val="22"/>
+        </w:rPr>
+        <w:t>Cause: environment variables set with $env:VAR_NAME in PowerShell are scoped to that one terminal process and do not persist across new windows -- exactly the same class of issue as the earlier 'aws not recognized' and 'terraform not recognized' PATH problems, just for an env var instead of PATH.</w:t>
+      </w:r>
+    </w:p>
+    <w:p>
+      <w:pPr/>
+      <w:r>
+        <w:rPr>
+          <w:b w:val="0"/>
+          <w:i w:val="0"/>
+          <w:sz w:val="22"/>
+        </w:rPr>
+        <w:t>Fix (normal case -- you still remember the password): cancel the prompt (Ctrl+C) and set the variable again in the new session before re-running plan:</w:t>
+      </w:r>
+    </w:p>
+    <w:p>
+      <w:pPr>
+        <w:shd w:val="clear" w:color="auto" w:fill="F2F2F2"/>
+      </w:pPr>
+      <w:r>
+        <w:rPr>
+          <w:rFonts w:ascii="Consolas" w:hAnsi="Consolas"/>
+          <w:sz w:val="19"/>
+        </w:rPr>
+        <w:t>$env:TF_VAR_db_password = "&lt;the same password used on the original terraform apply&gt;"</w:t>
+        <w:br/>
+      </w:r>
+      <w:r>
+        <w:rPr>
+          <w:rFonts w:ascii="Consolas" w:hAnsi="Consolas"/>
+          <w:sz w:val="19"/>
+        </w:rPr>
+        <w:t>terraform plan -out=tfplan</w:t>
+      </w:r>
+    </w:p>
+    <w:p>
+      <w:pPr>
+        <w:pBdr>
+          <w:left w:val="single" w:sz="18" w:space="8" w:color="C00000"/>
+        </w:pBdr>
+      </w:pPr>
+      <w:r>
+        <w:rPr>
+          <w:i/>
+          <w:color w:val="C00000"/>
+        </w:rPr>
+        <w:t xml:space="preserve">  Entering a different value than the original at this prompt does not fail -- Terraform will simply plan a password change on the RDS instance as a side effect alongside the intended misconfigurations, which pollutes the plan with an unrelated, unintended change.</w:t>
+      </w:r>
+    </w:p>
+    <w:p>
+      <w:pPr/>
+      <w:r>
+        <w:rPr>
+          <w:b w:val="0"/>
+          <w:i w:val="0"/>
+          <w:sz w:val="22"/>
+        </w:rPr>
+        <w:t>Fix (if the original password is genuinely forgotten): there is no way to retrieve it -- AWS RDS master passwords are write-only and are never stored anywhere retrievable, not in Terraform state, not in the AWS console, not via any API call. The only option is to set a new one:</w:t>
+      </w:r>
+    </w:p>
+    <w:p>
+      <w:pPr>
+        <w:shd w:val="clear" w:color="auto" w:fill="F2F2F2"/>
+      </w:pPr>
+      <w:r>
+        <w:rPr>
+          <w:rFonts w:ascii="Consolas" w:hAnsi="Consolas"/>
+          <w:sz w:val="19"/>
+        </w:rPr>
+        <w:t>$env:TF_VAR_db_password = "&lt;a new strong password&gt;"</w:t>
+        <w:br/>
+      </w:r>
+      <w:r>
+        <w:rPr>
+          <w:rFonts w:ascii="Consolas" w:hAnsi="Consolas"/>
+          <w:sz w:val="19"/>
+        </w:rPr>
+        <w:t>terraform plan -out=tfplan</w:t>
+        <w:br/>
+      </w:r>
+      <w:r>
+        <w:rPr>
+          <w:rFonts w:ascii="Consolas" w:hAnsi="Consolas"/>
+          <w:sz w:val="19"/>
+        </w:rPr>
+        <w:t># plan will show an in-place password update on aws_db_instance.main alongside the misconfig changes -- expected, not an error</w:t>
+        <w:br/>
+      </w:r>
+      <w:r>
+        <w:rPr>
+          <w:rFonts w:ascii="Consolas" w:hAnsi="Consolas"/>
+          <w:sz w:val="19"/>
+        </w:rPr>
+        <w:t>terraform apply tfplan</w:t>
+      </w:r>
+    </w:p>
+    <w:p>
+      <w:pPr>
+        <w:pBdr>
+          <w:left w:val="single" w:sz="18" w:space="8" w:color="2E74B5"/>
+        </w:pBdr>
+      </w:pPr>
+      <w:r>
+        <w:rPr>
+          <w:i/>
+          <w:color w:val="2E74B5"/>
+        </w:rPr>
+        <w:t xml:space="preserve">  After setting a new password this way, record it somewhere durable outside this chat (a local password manager, not pasted into any AI tool) -- otherwise the same forgotten-password situation recurs on the next new terminal session.</w:t>
+      </w:r>
+    </w:p>
+    <w:p>
+      <w:pPr>
+        <w:pStyle w:val="Heading1"/>
+      </w:pPr>
       <w:r/>
       <w:r>
-        <w:t>11. Next Steps</w:t>
+        <w:t>13. Next Steps</w:t>
       </w:r>
     </w:p>
     <w:p>

</xml_diff>